<commit_message>
Create root and docs CHANGELOG files with dates, update compiler script, and sync compiled Word docx deliverables
</commit_message>
<xml_diff>
--- a/docs/User_Manual.docx
+++ b/docs/User_Manual.docx
@@ -361,7 +361,7 @@
           <w:color w:val="374151"/>
           <w:sz w:val="21"/>
         </w:rPr>
-        <w:t>Click the upload area under **Bulk Excel CSV Upload** to open your file manager.</w:t>
+        <w:t>Under **Bulk Excel CSV Upload**, configure the **Sync Excel Rows To** platform checkboxes (Shopee TH, Lazada TH, TikTok TH). This determines which connected stores the batch products will be created on.</w:t>
       </w:r>
     </w:p>
     <w:p>
@@ -375,7 +375,7 @@
           <w:color w:val="374151"/>
           <w:sz w:val="21"/>
         </w:rPr>
-        <w:t>Select your completed Excel template spreadsheet (`.xlsx` or `.csv` format) and upload.</w:t>
+        <w:t>Click the upload area or drag-and-drop your completed Excel template spreadsheet (`.xlsx`, `.xls`, or `.csv` format) in the dashed file block.</w:t>
       </w:r>
     </w:p>
     <w:p>
@@ -389,7 +389,7 @@
           <w:color w:val="374151"/>
           <w:sz w:val="21"/>
         </w:rPr>
-        <w:t>The system will parse the rows, validate column schema constraints, create the Master SKUs, and push corresponding listings to Shopee, Lazada, and TikTok Shop.</w:t>
+        <w:t>The system will parse the rows, validate column schema constraints, create the Master SKUs, and push corresponding listings to selected channels.</w:t>
       </w:r>
     </w:p>
     <w:p>
@@ -418,6 +418,1288 @@
           <w:sz w:val="21"/>
         </w:rPr>
         <w:t>To ensure successful uploads, your spreadsheet must contain the following header columns:</w:t>
+      </w:r>
+    </w:p>
+    <w:tbl>
+      <w:tblPr>
+        <w:tblW w:type="auto" w:w="0"/>
+        <w:tblLayout w:type="autofit"/>
+        <w:tblLook w:firstColumn="1" w:firstRow="1" w:lastColumn="0" w:lastRow="0" w:noHBand="0" w:noVBand="1" w:val="04A0"/>
+      </w:tblPr>
+      <w:tblGrid>
+        <w:gridCol w:w="1872"/>
+        <w:gridCol w:w="1872"/>
+        <w:gridCol w:w="1872"/>
+        <w:gridCol w:w="1872"/>
+        <w:gridCol w:w="1872"/>
+      </w:tblGrid>
+      <w:tr>
+        <w:tc>
+          <w:tcPr>
+            <w:tcW w:type="dxa" w:w="1872"/>
+            <w:shd w:fill="6366F1"/>
+            <w:tcMar>
+              <w:top w:w="100" w:type="dxa"/>
+              <w:bottom w:w="100" w:type="dxa"/>
+              <w:left w:w="150" w:type="dxa"/>
+              <w:right w:w="150" w:type="dxa"/>
+            </w:tcMar>
+          </w:tcPr>
+          <w:p>
+            <w:r>
+              <w:rPr>
+                <w:rFonts w:ascii="Segoe UI" w:hAnsi="Segoe UI"/>
+                <w:b/>
+                <w:color w:val="FFFFFF"/>
+                <w:sz w:val="19"/>
+              </w:rPr>
+              <w:t>Column Header</w:t>
+            </w:r>
+          </w:p>
+        </w:tc>
+        <w:tc>
+          <w:tcPr>
+            <w:tcW w:type="dxa" w:w="1872"/>
+            <w:shd w:fill="6366F1"/>
+            <w:tcMar>
+              <w:top w:w="100" w:type="dxa"/>
+              <w:bottom w:w="100" w:type="dxa"/>
+              <w:left w:w="150" w:type="dxa"/>
+              <w:right w:w="150" w:type="dxa"/>
+            </w:tcMar>
+          </w:tcPr>
+          <w:p>
+            <w:r>
+              <w:rPr>
+                <w:rFonts w:ascii="Segoe UI" w:hAnsi="Segoe UI"/>
+                <w:b/>
+                <w:color w:val="FFFFFF"/>
+                <w:sz w:val="19"/>
+              </w:rPr>
+              <w:t>Data Type</w:t>
+            </w:r>
+          </w:p>
+        </w:tc>
+        <w:tc>
+          <w:tcPr>
+            <w:tcW w:type="dxa" w:w="1872"/>
+            <w:shd w:fill="6366F1"/>
+            <w:tcMar>
+              <w:top w:w="100" w:type="dxa"/>
+              <w:bottom w:w="100" w:type="dxa"/>
+              <w:left w:w="150" w:type="dxa"/>
+              <w:right w:w="150" w:type="dxa"/>
+            </w:tcMar>
+          </w:tcPr>
+          <w:p>
+            <w:r>
+              <w:rPr>
+                <w:rFonts w:ascii="Segoe UI" w:hAnsi="Segoe UI"/>
+                <w:b/>
+                <w:color w:val="FFFFFF"/>
+                <w:sz w:val="19"/>
+              </w:rPr>
+              <w:t>Required</w:t>
+            </w:r>
+          </w:p>
+        </w:tc>
+        <w:tc>
+          <w:tcPr>
+            <w:tcW w:type="dxa" w:w="1872"/>
+            <w:shd w:fill="6366F1"/>
+            <w:tcMar>
+              <w:top w:w="100" w:type="dxa"/>
+              <w:bottom w:w="100" w:type="dxa"/>
+              <w:left w:w="150" w:type="dxa"/>
+              <w:right w:w="150" w:type="dxa"/>
+            </w:tcMar>
+          </w:tcPr>
+          <w:p>
+            <w:r>
+              <w:rPr>
+                <w:rFonts w:ascii="Segoe UI" w:hAnsi="Segoe UI"/>
+                <w:b/>
+                <w:color w:val="FFFFFF"/>
+                <w:sz w:val="19"/>
+              </w:rPr>
+              <w:t>Sample Value</w:t>
+            </w:r>
+          </w:p>
+        </w:tc>
+        <w:tc>
+          <w:tcPr>
+            <w:tcW w:type="dxa" w:w="1872"/>
+            <w:shd w:fill="6366F1"/>
+            <w:tcMar>
+              <w:top w:w="100" w:type="dxa"/>
+              <w:bottom w:w="100" w:type="dxa"/>
+              <w:left w:w="150" w:type="dxa"/>
+              <w:right w:w="150" w:type="dxa"/>
+            </w:tcMar>
+          </w:tcPr>
+          <w:p>
+            <w:r>
+              <w:rPr>
+                <w:rFonts w:ascii="Segoe UI" w:hAnsi="Segoe UI"/>
+                <w:b/>
+                <w:color w:val="FFFFFF"/>
+                <w:sz w:val="19"/>
+              </w:rPr>
+              <w:t>Description</w:t>
+            </w:r>
+          </w:p>
+        </w:tc>
+      </w:tr>
+      <w:tr>
+        <w:tc>
+          <w:tcPr>
+            <w:tcW w:type="dxa" w:w="1872"/>
+            <w:shd w:fill="FFFFFF"/>
+            <w:tcMar>
+              <w:top w:w="100" w:type="dxa"/>
+              <w:bottom w:w="100" w:type="dxa"/>
+              <w:left w:w="150" w:type="dxa"/>
+              <w:right w:w="150" w:type="dxa"/>
+            </w:tcMar>
+          </w:tcPr>
+          <w:p>
+            <w:r>
+              <w:rPr>
+                <w:rFonts w:ascii="Segoe UI" w:hAnsi="Segoe UI"/>
+                <w:color w:val="374151"/>
+                <w:sz w:val="18"/>
+              </w:rPr>
+              <w:t>**master_sku**</w:t>
+            </w:r>
+          </w:p>
+        </w:tc>
+        <w:tc>
+          <w:tcPr>
+            <w:tcW w:type="dxa" w:w="1872"/>
+            <w:shd w:fill="FFFFFF"/>
+            <w:tcMar>
+              <w:top w:w="100" w:type="dxa"/>
+              <w:bottom w:w="100" w:type="dxa"/>
+              <w:left w:w="150" w:type="dxa"/>
+              <w:right w:w="150" w:type="dxa"/>
+            </w:tcMar>
+          </w:tcPr>
+          <w:p>
+            <w:r>
+              <w:rPr>
+                <w:rFonts w:ascii="Segoe UI" w:hAnsi="Segoe UI"/>
+                <w:color w:val="374151"/>
+                <w:sz w:val="18"/>
+              </w:rPr>
+              <w:t>String</w:t>
+            </w:r>
+          </w:p>
+        </w:tc>
+        <w:tc>
+          <w:tcPr>
+            <w:tcW w:type="dxa" w:w="1872"/>
+            <w:shd w:fill="FFFFFF"/>
+            <w:tcMar>
+              <w:top w:w="100" w:type="dxa"/>
+              <w:bottom w:w="100" w:type="dxa"/>
+              <w:left w:w="150" w:type="dxa"/>
+              <w:right w:w="150" w:type="dxa"/>
+            </w:tcMar>
+          </w:tcPr>
+          <w:p>
+            <w:r>
+              <w:rPr>
+                <w:rFonts w:ascii="Segoe UI" w:hAnsi="Segoe UI"/>
+                <w:color w:val="374151"/>
+                <w:sz w:val="18"/>
+              </w:rPr>
+              <w:t>Yes</w:t>
+            </w:r>
+          </w:p>
+        </w:tc>
+        <w:tc>
+          <w:tcPr>
+            <w:tcW w:type="dxa" w:w="1872"/>
+            <w:shd w:fill="FFFFFF"/>
+            <w:tcMar>
+              <w:top w:w="100" w:type="dxa"/>
+              <w:bottom w:w="100" w:type="dxa"/>
+              <w:left w:w="150" w:type="dxa"/>
+              <w:right w:w="150" w:type="dxa"/>
+            </w:tcMar>
+          </w:tcPr>
+          <w:p>
+            <w:r>
+              <w:rPr>
+                <w:rFonts w:ascii="Segoe UI" w:hAnsi="Segoe UI"/>
+                <w:color w:val="374151"/>
+                <w:sz w:val="18"/>
+              </w:rPr>
+              <w:t>`FIN-T-RED`</w:t>
+            </w:r>
+          </w:p>
+        </w:tc>
+        <w:tc>
+          <w:tcPr>
+            <w:tcW w:type="dxa" w:w="1872"/>
+            <w:shd w:fill="FFFFFF"/>
+            <w:tcMar>
+              <w:top w:w="100" w:type="dxa"/>
+              <w:bottom w:w="100" w:type="dxa"/>
+              <w:left w:w="150" w:type="dxa"/>
+              <w:right w:w="150" w:type="dxa"/>
+            </w:tcMar>
+          </w:tcPr>
+          <w:p>
+            <w:r>
+              <w:rPr>
+                <w:rFonts w:ascii="Segoe UI" w:hAnsi="Segoe UI"/>
+                <w:color w:val="374151"/>
+                <w:sz w:val="18"/>
+              </w:rPr>
+              <w:t>Unique identifier used to sync inventory centrally.</w:t>
+            </w:r>
+          </w:p>
+        </w:tc>
+      </w:tr>
+      <w:tr>
+        <w:tc>
+          <w:tcPr>
+            <w:tcW w:type="dxa" w:w="1872"/>
+            <w:shd w:fill="F9FAFB"/>
+            <w:tcMar>
+              <w:top w:w="100" w:type="dxa"/>
+              <w:bottom w:w="100" w:type="dxa"/>
+              <w:left w:w="150" w:type="dxa"/>
+              <w:right w:w="150" w:type="dxa"/>
+            </w:tcMar>
+          </w:tcPr>
+          <w:p>
+            <w:r>
+              <w:rPr>
+                <w:rFonts w:ascii="Segoe UI" w:hAnsi="Segoe UI"/>
+                <w:color w:val="374151"/>
+                <w:sz w:val="18"/>
+              </w:rPr>
+              <w:t>**product_name**</w:t>
+            </w:r>
+          </w:p>
+        </w:tc>
+        <w:tc>
+          <w:tcPr>
+            <w:tcW w:type="dxa" w:w="1872"/>
+            <w:shd w:fill="F9FAFB"/>
+            <w:tcMar>
+              <w:top w:w="100" w:type="dxa"/>
+              <w:bottom w:w="100" w:type="dxa"/>
+              <w:left w:w="150" w:type="dxa"/>
+              <w:right w:w="150" w:type="dxa"/>
+            </w:tcMar>
+          </w:tcPr>
+          <w:p>
+            <w:r>
+              <w:rPr>
+                <w:rFonts w:ascii="Segoe UI" w:hAnsi="Segoe UI"/>
+                <w:color w:val="374151"/>
+                <w:sz w:val="18"/>
+              </w:rPr>
+              <w:t>String</w:t>
+            </w:r>
+          </w:p>
+        </w:tc>
+        <w:tc>
+          <w:tcPr>
+            <w:tcW w:type="dxa" w:w="1872"/>
+            <w:shd w:fill="F9FAFB"/>
+            <w:tcMar>
+              <w:top w:w="100" w:type="dxa"/>
+              <w:bottom w:w="100" w:type="dxa"/>
+              <w:left w:w="150" w:type="dxa"/>
+              <w:right w:w="150" w:type="dxa"/>
+            </w:tcMar>
+          </w:tcPr>
+          <w:p>
+            <w:r>
+              <w:rPr>
+                <w:rFonts w:ascii="Segoe UI" w:hAnsi="Segoe UI"/>
+                <w:color w:val="374151"/>
+                <w:sz w:val="18"/>
+              </w:rPr>
+              <w:t>Yes</w:t>
+            </w:r>
+          </w:p>
+        </w:tc>
+        <w:tc>
+          <w:tcPr>
+            <w:tcW w:type="dxa" w:w="1872"/>
+            <w:shd w:fill="F9FAFB"/>
+            <w:tcMar>
+              <w:top w:w="100" w:type="dxa"/>
+              <w:bottom w:w="100" w:type="dxa"/>
+              <w:left w:w="150" w:type="dxa"/>
+              <w:right w:w="150" w:type="dxa"/>
+            </w:tcMar>
+          </w:tcPr>
+          <w:p>
+            <w:r>
+              <w:rPr>
+                <w:rFonts w:ascii="Segoe UI" w:hAnsi="Segoe UI"/>
+                <w:color w:val="374151"/>
+                <w:sz w:val="18"/>
+              </w:rPr>
+              <w:t>`Premium T-Shirt (Red)`</w:t>
+            </w:r>
+          </w:p>
+        </w:tc>
+        <w:tc>
+          <w:tcPr>
+            <w:tcW w:type="dxa" w:w="1872"/>
+            <w:shd w:fill="F9FAFB"/>
+            <w:tcMar>
+              <w:top w:w="100" w:type="dxa"/>
+              <w:bottom w:w="100" w:type="dxa"/>
+              <w:left w:w="150" w:type="dxa"/>
+              <w:right w:w="150" w:type="dxa"/>
+            </w:tcMar>
+          </w:tcPr>
+          <w:p>
+            <w:r>
+              <w:rPr>
+                <w:rFonts w:ascii="Segoe UI" w:hAnsi="Segoe UI"/>
+                <w:color w:val="374151"/>
+                <w:sz w:val="18"/>
+              </w:rPr>
+              <w:t>Product display title.</w:t>
+            </w:r>
+          </w:p>
+        </w:tc>
+      </w:tr>
+      <w:tr>
+        <w:tc>
+          <w:tcPr>
+            <w:tcW w:type="dxa" w:w="1872"/>
+            <w:shd w:fill="FFFFFF"/>
+            <w:tcMar>
+              <w:top w:w="100" w:type="dxa"/>
+              <w:bottom w:w="100" w:type="dxa"/>
+              <w:left w:w="150" w:type="dxa"/>
+              <w:right w:w="150" w:type="dxa"/>
+            </w:tcMar>
+          </w:tcPr>
+          <w:p>
+            <w:r>
+              <w:rPr>
+                <w:rFonts w:ascii="Segoe UI" w:hAnsi="Segoe UI"/>
+                <w:color w:val="374151"/>
+                <w:sz w:val="18"/>
+              </w:rPr>
+              <w:t>**cost_price**</w:t>
+            </w:r>
+          </w:p>
+        </w:tc>
+        <w:tc>
+          <w:tcPr>
+            <w:tcW w:type="dxa" w:w="1872"/>
+            <w:shd w:fill="FFFFFF"/>
+            <w:tcMar>
+              <w:top w:w="100" w:type="dxa"/>
+              <w:bottom w:w="100" w:type="dxa"/>
+              <w:left w:w="150" w:type="dxa"/>
+              <w:right w:w="150" w:type="dxa"/>
+            </w:tcMar>
+          </w:tcPr>
+          <w:p>
+            <w:r>
+              <w:rPr>
+                <w:rFonts w:ascii="Segoe UI" w:hAnsi="Segoe UI"/>
+                <w:color w:val="374151"/>
+                <w:sz w:val="18"/>
+              </w:rPr>
+              <w:t>Decimal</w:t>
+            </w:r>
+          </w:p>
+        </w:tc>
+        <w:tc>
+          <w:tcPr>
+            <w:tcW w:type="dxa" w:w="1872"/>
+            <w:shd w:fill="FFFFFF"/>
+            <w:tcMar>
+              <w:top w:w="100" w:type="dxa"/>
+              <w:bottom w:w="100" w:type="dxa"/>
+              <w:left w:w="150" w:type="dxa"/>
+              <w:right w:w="150" w:type="dxa"/>
+            </w:tcMar>
+          </w:tcPr>
+          <w:p>
+            <w:r>
+              <w:rPr>
+                <w:rFonts w:ascii="Segoe UI" w:hAnsi="Segoe UI"/>
+                <w:color w:val="374151"/>
+                <w:sz w:val="18"/>
+              </w:rPr>
+              <w:t>Yes</w:t>
+            </w:r>
+          </w:p>
+        </w:tc>
+        <w:tc>
+          <w:tcPr>
+            <w:tcW w:type="dxa" w:w="1872"/>
+            <w:shd w:fill="FFFFFF"/>
+            <w:tcMar>
+              <w:top w:w="100" w:type="dxa"/>
+              <w:bottom w:w="100" w:type="dxa"/>
+              <w:left w:w="150" w:type="dxa"/>
+              <w:right w:w="150" w:type="dxa"/>
+            </w:tcMar>
+          </w:tcPr>
+          <w:p>
+            <w:r>
+              <w:rPr>
+                <w:rFonts w:ascii="Segoe UI" w:hAnsi="Segoe UI"/>
+                <w:color w:val="374151"/>
+                <w:sz w:val="18"/>
+              </w:rPr>
+              <w:t>`150.00`</w:t>
+            </w:r>
+          </w:p>
+        </w:tc>
+        <w:tc>
+          <w:tcPr>
+            <w:tcW w:type="dxa" w:w="1872"/>
+            <w:shd w:fill="FFFFFF"/>
+            <w:tcMar>
+              <w:top w:w="100" w:type="dxa"/>
+              <w:bottom w:w="100" w:type="dxa"/>
+              <w:left w:w="150" w:type="dxa"/>
+              <w:right w:w="150" w:type="dxa"/>
+            </w:tcMar>
+          </w:tcPr>
+          <w:p>
+            <w:r>
+              <w:rPr>
+                <w:rFonts w:ascii="Segoe UI" w:hAnsi="Segoe UI"/>
+                <w:color w:val="374151"/>
+                <w:sz w:val="18"/>
+              </w:rPr>
+              <w:t>Cost of goods sold.</w:t>
+            </w:r>
+          </w:p>
+        </w:tc>
+      </w:tr>
+      <w:tr>
+        <w:tc>
+          <w:tcPr>
+            <w:tcW w:type="dxa" w:w="1872"/>
+            <w:shd w:fill="F9FAFB"/>
+            <w:tcMar>
+              <w:top w:w="100" w:type="dxa"/>
+              <w:bottom w:w="100" w:type="dxa"/>
+              <w:left w:w="150" w:type="dxa"/>
+              <w:right w:w="150" w:type="dxa"/>
+            </w:tcMar>
+          </w:tcPr>
+          <w:p>
+            <w:r>
+              <w:rPr>
+                <w:rFonts w:ascii="Segoe UI" w:hAnsi="Segoe UI"/>
+                <w:color w:val="374151"/>
+                <w:sz w:val="18"/>
+              </w:rPr>
+              <w:t>**selling_price**</w:t>
+            </w:r>
+          </w:p>
+        </w:tc>
+        <w:tc>
+          <w:tcPr>
+            <w:tcW w:type="dxa" w:w="1872"/>
+            <w:shd w:fill="F9FAFB"/>
+            <w:tcMar>
+              <w:top w:w="100" w:type="dxa"/>
+              <w:bottom w:w="100" w:type="dxa"/>
+              <w:left w:w="150" w:type="dxa"/>
+              <w:right w:w="150" w:type="dxa"/>
+            </w:tcMar>
+          </w:tcPr>
+          <w:p>
+            <w:r>
+              <w:rPr>
+                <w:rFonts w:ascii="Segoe UI" w:hAnsi="Segoe UI"/>
+                <w:color w:val="374151"/>
+                <w:sz w:val="18"/>
+              </w:rPr>
+              <w:t>Decimal</w:t>
+            </w:r>
+          </w:p>
+        </w:tc>
+        <w:tc>
+          <w:tcPr>
+            <w:tcW w:type="dxa" w:w="1872"/>
+            <w:shd w:fill="F9FAFB"/>
+            <w:tcMar>
+              <w:top w:w="100" w:type="dxa"/>
+              <w:bottom w:w="100" w:type="dxa"/>
+              <w:left w:w="150" w:type="dxa"/>
+              <w:right w:w="150" w:type="dxa"/>
+            </w:tcMar>
+          </w:tcPr>
+          <w:p>
+            <w:r>
+              <w:rPr>
+                <w:rFonts w:ascii="Segoe UI" w:hAnsi="Segoe UI"/>
+                <w:color w:val="374151"/>
+                <w:sz w:val="18"/>
+              </w:rPr>
+              <w:t>Yes</w:t>
+            </w:r>
+          </w:p>
+        </w:tc>
+        <w:tc>
+          <w:tcPr>
+            <w:tcW w:type="dxa" w:w="1872"/>
+            <w:shd w:fill="F9FAFB"/>
+            <w:tcMar>
+              <w:top w:w="100" w:type="dxa"/>
+              <w:bottom w:w="100" w:type="dxa"/>
+              <w:left w:w="150" w:type="dxa"/>
+              <w:right w:w="150" w:type="dxa"/>
+            </w:tcMar>
+          </w:tcPr>
+          <w:p>
+            <w:r>
+              <w:rPr>
+                <w:rFonts w:ascii="Segoe UI" w:hAnsi="Segoe UI"/>
+                <w:color w:val="374151"/>
+                <w:sz w:val="18"/>
+              </w:rPr>
+              <w:t>`299.00`</w:t>
+            </w:r>
+          </w:p>
+        </w:tc>
+        <w:tc>
+          <w:tcPr>
+            <w:tcW w:type="dxa" w:w="1872"/>
+            <w:shd w:fill="F9FAFB"/>
+            <w:tcMar>
+              <w:top w:w="100" w:type="dxa"/>
+              <w:bottom w:w="100" w:type="dxa"/>
+              <w:left w:w="150" w:type="dxa"/>
+              <w:right w:w="150" w:type="dxa"/>
+            </w:tcMar>
+          </w:tcPr>
+          <w:p>
+            <w:r>
+              <w:rPr>
+                <w:rFonts w:ascii="Segoe UI" w:hAnsi="Segoe UI"/>
+                <w:color w:val="374151"/>
+                <w:sz w:val="18"/>
+              </w:rPr>
+              <w:t>Suggested retail price.</w:t>
+            </w:r>
+          </w:p>
+        </w:tc>
+      </w:tr>
+      <w:tr>
+        <w:tc>
+          <w:tcPr>
+            <w:tcW w:type="dxa" w:w="1872"/>
+            <w:shd w:fill="FFFFFF"/>
+            <w:tcMar>
+              <w:top w:w="100" w:type="dxa"/>
+              <w:bottom w:w="100" w:type="dxa"/>
+              <w:left w:w="150" w:type="dxa"/>
+              <w:right w:w="150" w:type="dxa"/>
+            </w:tcMar>
+          </w:tcPr>
+          <w:p>
+            <w:r>
+              <w:rPr>
+                <w:rFonts w:ascii="Segoe UI" w:hAnsi="Segoe UI"/>
+                <w:color w:val="374151"/>
+                <w:sz w:val="18"/>
+              </w:rPr>
+              <w:t>**stock_level**</w:t>
+            </w:r>
+          </w:p>
+        </w:tc>
+        <w:tc>
+          <w:tcPr>
+            <w:tcW w:type="dxa" w:w="1872"/>
+            <w:shd w:fill="FFFFFF"/>
+            <w:tcMar>
+              <w:top w:w="100" w:type="dxa"/>
+              <w:bottom w:w="100" w:type="dxa"/>
+              <w:left w:w="150" w:type="dxa"/>
+              <w:right w:w="150" w:type="dxa"/>
+            </w:tcMar>
+          </w:tcPr>
+          <w:p>
+            <w:r>
+              <w:rPr>
+                <w:rFonts w:ascii="Segoe UI" w:hAnsi="Segoe UI"/>
+                <w:color w:val="374151"/>
+                <w:sz w:val="18"/>
+              </w:rPr>
+              <w:t>Integer</w:t>
+            </w:r>
+          </w:p>
+        </w:tc>
+        <w:tc>
+          <w:tcPr>
+            <w:tcW w:type="dxa" w:w="1872"/>
+            <w:shd w:fill="FFFFFF"/>
+            <w:tcMar>
+              <w:top w:w="100" w:type="dxa"/>
+              <w:bottom w:w="100" w:type="dxa"/>
+              <w:left w:w="150" w:type="dxa"/>
+              <w:right w:w="150" w:type="dxa"/>
+            </w:tcMar>
+          </w:tcPr>
+          <w:p>
+            <w:r>
+              <w:rPr>
+                <w:rFonts w:ascii="Segoe UI" w:hAnsi="Segoe UI"/>
+                <w:color w:val="374151"/>
+                <w:sz w:val="18"/>
+              </w:rPr>
+              <w:t>Yes</w:t>
+            </w:r>
+          </w:p>
+        </w:tc>
+        <w:tc>
+          <w:tcPr>
+            <w:tcW w:type="dxa" w:w="1872"/>
+            <w:shd w:fill="FFFFFF"/>
+            <w:tcMar>
+              <w:top w:w="100" w:type="dxa"/>
+              <w:bottom w:w="100" w:type="dxa"/>
+              <w:left w:w="150" w:type="dxa"/>
+              <w:right w:w="150" w:type="dxa"/>
+            </w:tcMar>
+          </w:tcPr>
+          <w:p>
+            <w:r>
+              <w:rPr>
+                <w:rFonts w:ascii="Segoe UI" w:hAnsi="Segoe UI"/>
+                <w:color w:val="374151"/>
+                <w:sz w:val="18"/>
+              </w:rPr>
+              <w:t>`142`</w:t>
+            </w:r>
+          </w:p>
+        </w:tc>
+        <w:tc>
+          <w:tcPr>
+            <w:tcW w:type="dxa" w:w="1872"/>
+            <w:shd w:fill="FFFFFF"/>
+            <w:tcMar>
+              <w:top w:w="100" w:type="dxa"/>
+              <w:bottom w:w="100" w:type="dxa"/>
+              <w:left w:w="150" w:type="dxa"/>
+              <w:right w:w="150" w:type="dxa"/>
+            </w:tcMar>
+          </w:tcPr>
+          <w:p>
+            <w:r>
+              <w:rPr>
+                <w:rFonts w:ascii="Segoe UI" w:hAnsi="Segoe UI"/>
+                <w:color w:val="374151"/>
+                <w:sz w:val="18"/>
+              </w:rPr>
+              <w:t>Actual physical stock count in the warehouse.</w:t>
+            </w:r>
+          </w:p>
+        </w:tc>
+      </w:tr>
+      <w:tr>
+        <w:tc>
+          <w:tcPr>
+            <w:tcW w:type="dxa" w:w="1872"/>
+            <w:shd w:fill="F9FAFB"/>
+            <w:tcMar>
+              <w:top w:w="100" w:type="dxa"/>
+              <w:bottom w:w="100" w:type="dxa"/>
+              <w:left w:w="150" w:type="dxa"/>
+              <w:right w:w="150" w:type="dxa"/>
+            </w:tcMar>
+          </w:tcPr>
+          <w:p>
+            <w:r>
+              <w:rPr>
+                <w:rFonts w:ascii="Segoe UI" w:hAnsi="Segoe UI"/>
+                <w:color w:val="374151"/>
+                <w:sz w:val="18"/>
+              </w:rPr>
+              <w:t>**shopee_sku**</w:t>
+            </w:r>
+          </w:p>
+        </w:tc>
+        <w:tc>
+          <w:tcPr>
+            <w:tcW w:type="dxa" w:w="1872"/>
+            <w:shd w:fill="F9FAFB"/>
+            <w:tcMar>
+              <w:top w:w="100" w:type="dxa"/>
+              <w:bottom w:w="100" w:type="dxa"/>
+              <w:left w:w="150" w:type="dxa"/>
+              <w:right w:w="150" w:type="dxa"/>
+            </w:tcMar>
+          </w:tcPr>
+          <w:p>
+            <w:r>
+              <w:rPr>
+                <w:rFonts w:ascii="Segoe UI" w:hAnsi="Segoe UI"/>
+                <w:color w:val="374151"/>
+                <w:sz w:val="18"/>
+              </w:rPr>
+              <w:t>String</w:t>
+            </w:r>
+          </w:p>
+        </w:tc>
+        <w:tc>
+          <w:tcPr>
+            <w:tcW w:type="dxa" w:w="1872"/>
+            <w:shd w:fill="F9FAFB"/>
+            <w:tcMar>
+              <w:top w:w="100" w:type="dxa"/>
+              <w:bottom w:w="100" w:type="dxa"/>
+              <w:left w:w="150" w:type="dxa"/>
+              <w:right w:w="150" w:type="dxa"/>
+            </w:tcMar>
+          </w:tcPr>
+          <w:p>
+            <w:r>
+              <w:rPr>
+                <w:rFonts w:ascii="Segoe UI" w:hAnsi="Segoe UI"/>
+                <w:color w:val="374151"/>
+                <w:sz w:val="18"/>
+              </w:rPr>
+              <w:t>No</w:t>
+            </w:r>
+          </w:p>
+        </w:tc>
+        <w:tc>
+          <w:tcPr>
+            <w:tcW w:type="dxa" w:w="1872"/>
+            <w:shd w:fill="F9FAFB"/>
+            <w:tcMar>
+              <w:top w:w="100" w:type="dxa"/>
+              <w:bottom w:w="100" w:type="dxa"/>
+              <w:left w:w="150" w:type="dxa"/>
+              <w:right w:w="150" w:type="dxa"/>
+            </w:tcMar>
+          </w:tcPr>
+          <w:p>
+            <w:r>
+              <w:rPr>
+                <w:rFonts w:ascii="Segoe UI" w:hAnsi="Segoe UI"/>
+                <w:color w:val="374151"/>
+                <w:sz w:val="18"/>
+              </w:rPr>
+              <w:t>`SH-T-RED`</w:t>
+            </w:r>
+          </w:p>
+        </w:tc>
+        <w:tc>
+          <w:tcPr>
+            <w:tcW w:type="dxa" w:w="1872"/>
+            <w:shd w:fill="F9FAFB"/>
+            <w:tcMar>
+              <w:top w:w="100" w:type="dxa"/>
+              <w:bottom w:w="100" w:type="dxa"/>
+              <w:left w:w="150" w:type="dxa"/>
+              <w:right w:w="150" w:type="dxa"/>
+            </w:tcMar>
+          </w:tcPr>
+          <w:p>
+            <w:r>
+              <w:rPr>
+                <w:rFonts w:ascii="Segoe UI" w:hAnsi="Segoe UI"/>
+                <w:color w:val="374151"/>
+                <w:sz w:val="18"/>
+              </w:rPr>
+              <w:t>Shopee product listing SKU maps (maps Shopee stock).</w:t>
+            </w:r>
+          </w:p>
+        </w:tc>
+      </w:tr>
+      <w:tr>
+        <w:tc>
+          <w:tcPr>
+            <w:tcW w:type="dxa" w:w="1872"/>
+            <w:shd w:fill="FFFFFF"/>
+            <w:tcMar>
+              <w:top w:w="100" w:type="dxa"/>
+              <w:bottom w:w="100" w:type="dxa"/>
+              <w:left w:w="150" w:type="dxa"/>
+              <w:right w:w="150" w:type="dxa"/>
+            </w:tcMar>
+          </w:tcPr>
+          <w:p>
+            <w:r>
+              <w:rPr>
+                <w:rFonts w:ascii="Segoe UI" w:hAnsi="Segoe UI"/>
+                <w:color w:val="374151"/>
+                <w:sz w:val="18"/>
+              </w:rPr>
+              <w:t>**lazada_sku**</w:t>
+            </w:r>
+          </w:p>
+        </w:tc>
+        <w:tc>
+          <w:tcPr>
+            <w:tcW w:type="dxa" w:w="1872"/>
+            <w:shd w:fill="FFFFFF"/>
+            <w:tcMar>
+              <w:top w:w="100" w:type="dxa"/>
+              <w:bottom w:w="100" w:type="dxa"/>
+              <w:left w:w="150" w:type="dxa"/>
+              <w:right w:w="150" w:type="dxa"/>
+            </w:tcMar>
+          </w:tcPr>
+          <w:p>
+            <w:r>
+              <w:rPr>
+                <w:rFonts w:ascii="Segoe UI" w:hAnsi="Segoe UI"/>
+                <w:color w:val="374151"/>
+                <w:sz w:val="18"/>
+              </w:rPr>
+              <w:t>String</w:t>
+            </w:r>
+          </w:p>
+        </w:tc>
+        <w:tc>
+          <w:tcPr>
+            <w:tcW w:type="dxa" w:w="1872"/>
+            <w:shd w:fill="FFFFFF"/>
+            <w:tcMar>
+              <w:top w:w="100" w:type="dxa"/>
+              <w:bottom w:w="100" w:type="dxa"/>
+              <w:left w:w="150" w:type="dxa"/>
+              <w:right w:w="150" w:type="dxa"/>
+            </w:tcMar>
+          </w:tcPr>
+          <w:p>
+            <w:r>
+              <w:rPr>
+                <w:rFonts w:ascii="Segoe UI" w:hAnsi="Segoe UI"/>
+                <w:color w:val="374151"/>
+                <w:sz w:val="18"/>
+              </w:rPr>
+              <w:t>No</w:t>
+            </w:r>
+          </w:p>
+        </w:tc>
+        <w:tc>
+          <w:tcPr>
+            <w:tcW w:type="dxa" w:w="1872"/>
+            <w:shd w:fill="FFFFFF"/>
+            <w:tcMar>
+              <w:top w:w="100" w:type="dxa"/>
+              <w:bottom w:w="100" w:type="dxa"/>
+              <w:left w:w="150" w:type="dxa"/>
+              <w:right w:w="150" w:type="dxa"/>
+            </w:tcMar>
+          </w:tcPr>
+          <w:p>
+            <w:r>
+              <w:rPr>
+                <w:rFonts w:ascii="Segoe UI" w:hAnsi="Segoe UI"/>
+                <w:color w:val="374151"/>
+                <w:sz w:val="18"/>
+              </w:rPr>
+              <w:t>`LZ-T-RED`</w:t>
+            </w:r>
+          </w:p>
+        </w:tc>
+        <w:tc>
+          <w:tcPr>
+            <w:tcW w:type="dxa" w:w="1872"/>
+            <w:shd w:fill="FFFFFF"/>
+            <w:tcMar>
+              <w:top w:w="100" w:type="dxa"/>
+              <w:bottom w:w="100" w:type="dxa"/>
+              <w:left w:w="150" w:type="dxa"/>
+              <w:right w:w="150" w:type="dxa"/>
+            </w:tcMar>
+          </w:tcPr>
+          <w:p>
+            <w:r>
+              <w:rPr>
+                <w:rFonts w:ascii="Segoe UI" w:hAnsi="Segoe UI"/>
+                <w:color w:val="374151"/>
+                <w:sz w:val="18"/>
+              </w:rPr>
+              <w:t>Lazada product listing SKU maps (maps Lazada stock).</w:t>
+            </w:r>
+          </w:p>
+        </w:tc>
+      </w:tr>
+      <w:tr>
+        <w:tc>
+          <w:tcPr>
+            <w:tcW w:type="dxa" w:w="1872"/>
+            <w:shd w:fill="F9FAFB"/>
+            <w:tcMar>
+              <w:top w:w="100" w:type="dxa"/>
+              <w:bottom w:w="100" w:type="dxa"/>
+              <w:left w:w="150" w:type="dxa"/>
+              <w:right w:w="150" w:type="dxa"/>
+            </w:tcMar>
+          </w:tcPr>
+          <w:p>
+            <w:r>
+              <w:rPr>
+                <w:rFonts w:ascii="Segoe UI" w:hAnsi="Segoe UI"/>
+                <w:color w:val="374151"/>
+                <w:sz w:val="18"/>
+              </w:rPr>
+              <w:t>**tiktok_sku**</w:t>
+            </w:r>
+          </w:p>
+        </w:tc>
+        <w:tc>
+          <w:tcPr>
+            <w:tcW w:type="dxa" w:w="1872"/>
+            <w:shd w:fill="F9FAFB"/>
+            <w:tcMar>
+              <w:top w:w="100" w:type="dxa"/>
+              <w:bottom w:w="100" w:type="dxa"/>
+              <w:left w:w="150" w:type="dxa"/>
+              <w:right w:w="150" w:type="dxa"/>
+            </w:tcMar>
+          </w:tcPr>
+          <w:p>
+            <w:r>
+              <w:rPr>
+                <w:rFonts w:ascii="Segoe UI" w:hAnsi="Segoe UI"/>
+                <w:color w:val="374151"/>
+                <w:sz w:val="18"/>
+              </w:rPr>
+              <w:t>String</w:t>
+            </w:r>
+          </w:p>
+        </w:tc>
+        <w:tc>
+          <w:tcPr>
+            <w:tcW w:type="dxa" w:w="1872"/>
+            <w:shd w:fill="F9FAFB"/>
+            <w:tcMar>
+              <w:top w:w="100" w:type="dxa"/>
+              <w:bottom w:w="100" w:type="dxa"/>
+              <w:left w:w="150" w:type="dxa"/>
+              <w:right w:w="150" w:type="dxa"/>
+            </w:tcMar>
+          </w:tcPr>
+          <w:p>
+            <w:r>
+              <w:rPr>
+                <w:rFonts w:ascii="Segoe UI" w:hAnsi="Segoe UI"/>
+                <w:color w:val="374151"/>
+                <w:sz w:val="18"/>
+              </w:rPr>
+              <w:t>No</w:t>
+            </w:r>
+          </w:p>
+        </w:tc>
+        <w:tc>
+          <w:tcPr>
+            <w:tcW w:type="dxa" w:w="1872"/>
+            <w:shd w:fill="F9FAFB"/>
+            <w:tcMar>
+              <w:top w:w="100" w:type="dxa"/>
+              <w:bottom w:w="100" w:type="dxa"/>
+              <w:left w:w="150" w:type="dxa"/>
+              <w:right w:w="150" w:type="dxa"/>
+            </w:tcMar>
+          </w:tcPr>
+          <w:p>
+            <w:r>
+              <w:rPr>
+                <w:rFonts w:ascii="Segoe UI" w:hAnsi="Segoe UI"/>
+                <w:color w:val="374151"/>
+                <w:sz w:val="18"/>
+              </w:rPr>
+              <w:t>`TT-T-RED`</w:t>
+            </w:r>
+          </w:p>
+        </w:tc>
+        <w:tc>
+          <w:tcPr>
+            <w:tcW w:type="dxa" w:w="1872"/>
+            <w:shd w:fill="F9FAFB"/>
+            <w:tcMar>
+              <w:top w:w="100" w:type="dxa"/>
+              <w:bottom w:w="100" w:type="dxa"/>
+              <w:left w:w="150" w:type="dxa"/>
+              <w:right w:w="150" w:type="dxa"/>
+            </w:tcMar>
+          </w:tcPr>
+          <w:p>
+            <w:r>
+              <w:rPr>
+                <w:rFonts w:ascii="Segoe UI" w:hAnsi="Segoe UI"/>
+                <w:color w:val="374151"/>
+                <w:sz w:val="18"/>
+              </w:rPr>
+              <w:t>TikTok product listing SKU maps (maps TikTok stock).</w:t>
+            </w:r>
+          </w:p>
+        </w:tc>
+      </w:tr>
+    </w:tbl>
+    <w:p/>
+    <w:p>
+      <w:pPr>
+        <w:spacing w:before="0" w:after="120" w:line="276" w:lineRule="auto"/>
+      </w:pPr>
+      <w:r>
+        <w:rPr>
+          <w:rFonts w:ascii="Segoe UI" w:hAnsi="Segoe UI"/>
+          <w:color w:val="374151"/>
+          <w:sz w:val="21"/>
+        </w:rPr>
+        <w:t>---</w:t>
+      </w:r>
+    </w:p>
+    <w:p>
+      <w:pPr>
+        <w:keepNext/>
+        <w:spacing w:before="240" w:after="80"/>
+      </w:pPr>
+      <w:r>
+        <w:rPr>
+          <w:rFonts w:ascii="Segoe UI" w:hAnsi="Segoe UI"/>
+          <w:b/>
+          <w:color w:val="06B6D4"/>
+          <w:sz w:val="30"/>
+        </w:rPr>
+        <w:t>4. Managing Central Catalog (Create, Edit, Delete)</w:t>
+      </w:r>
+    </w:p>
+    <w:p>
+      <w:pPr>
+        <w:spacing w:before="0" w:after="120" w:line="276" w:lineRule="auto"/>
+      </w:pPr>
+      <w:r>
+        <w:rPr>
+          <w:rFonts w:ascii="Segoe UI" w:hAnsi="Segoe UI"/>
+          <w:color w:val="374151"/>
+          <w:sz w:val="21"/>
+        </w:rPr>
+        <w:t>For fine-grained inventory control, navigate to the **Stock &amp; SKU Mappings** tab on the sidebar.</w:t>
+      </w:r>
+    </w:p>
+    <w:p>
+      <w:pPr>
+        <w:keepNext/>
+        <w:spacing w:before="240" w:after="80"/>
+      </w:pPr>
+      <w:r>
+        <w:rPr>
+          <w:rFonts w:ascii="Segoe UI" w:hAnsi="Segoe UI"/>
+          <w:b/>
+          <w:color w:val="374151"/>
+          <w:sz w:val="24"/>
+        </w:rPr>
+        <w:t>4.1 Create (Add Master SKU)</w:t>
+      </w:r>
+    </w:p>
+    <w:p>
+      <w:pPr>
+        <w:pStyle w:val="ListNumber"/>
+        <w:spacing w:before="0" w:after="40"/>
+      </w:pPr>
+      <w:r>
+        <w:rPr>
+          <w:rFonts w:ascii="Segoe UI" w:hAnsi="Segoe UI"/>
+          <w:color w:val="374151"/>
+          <w:sz w:val="21"/>
+        </w:rPr>
+        <w:t>Click the **➕ Add Product** button above the inventory table.</w:t>
+      </w:r>
+    </w:p>
+    <w:p>
+      <w:pPr>
+        <w:pStyle w:val="ListNumber"/>
+        <w:spacing w:before="0" w:after="40"/>
+      </w:pPr>
+      <w:r>
+        <w:rPr>
+          <w:rFonts w:ascii="Segoe UI" w:hAnsi="Segoe UI"/>
+          <w:color w:val="374151"/>
+          <w:sz w:val="21"/>
+        </w:rPr>
+        <w:t>Fill in the Master SKU, Name, Stock, and base price.</w:t>
+      </w:r>
+    </w:p>
+    <w:p>
+      <w:pPr>
+        <w:pStyle w:val="ListNumber"/>
+        <w:spacing w:before="0" w:after="40"/>
+      </w:pPr>
+      <w:r>
+        <w:rPr>
+          <w:rFonts w:ascii="Segoe UI" w:hAnsi="Segoe UI"/>
+          <w:color w:val="374151"/>
+          <w:sz w:val="21"/>
+        </w:rPr>
+        <w:t>Check target platforms under **Sync Platforms** (Shopee, Lazada, TikTok).</w:t>
+      </w:r>
+    </w:p>
+    <w:p>
+      <w:pPr>
+        <w:pStyle w:val="ListNumber"/>
+        <w:spacing w:before="0" w:after="40"/>
+      </w:pPr>
+      <w:r>
+        <w:rPr>
+          <w:rFonts w:ascii="Segoe UI" w:hAnsi="Segoe UI"/>
+          <w:color w:val="374151"/>
+          <w:sz w:val="21"/>
+        </w:rPr>
+        <w:t>Click **Create Product**. The system adds the master record and registers linked listing endpoints.</w:t>
+      </w:r>
+    </w:p>
+    <w:p>
+      <w:pPr>
+        <w:keepNext/>
+        <w:spacing w:before="240" w:after="80"/>
+      </w:pPr>
+      <w:r>
+        <w:rPr>
+          <w:rFonts w:ascii="Segoe UI" w:hAnsi="Segoe UI"/>
+          <w:b/>
+          <w:color w:val="374151"/>
+          <w:sz w:val="24"/>
+        </w:rPr>
+        <w:t>4.2 Edit (Update Master SKU)</w:t>
+      </w:r>
+    </w:p>
+    <w:p>
+      <w:pPr>
+        <w:pStyle w:val="ListNumber"/>
+        <w:spacing w:before="0" w:after="40"/>
+      </w:pPr>
+      <w:r>
+        <w:rPr>
+          <w:rFonts w:ascii="Segoe UI" w:hAnsi="Segoe UI"/>
+          <w:color w:val="374151"/>
+          <w:sz w:val="21"/>
+        </w:rPr>
+        <w:t>Click the **✏️ Edit** button in the actions column of the target product row.</w:t>
+      </w:r>
+    </w:p>
+    <w:p>
+      <w:pPr>
+        <w:pStyle w:val="ListNumber"/>
+        <w:spacing w:before="0" w:after="40"/>
+      </w:pPr>
+      <w:r>
+        <w:rPr>
+          <w:rFonts w:ascii="Segoe UI" w:hAnsi="Segoe UI"/>
+          <w:color w:val="374151"/>
+          <w:sz w:val="21"/>
+        </w:rPr>
+        <w:t>Modify name, central stock quantity, or base retail price.</w:t>
+      </w:r>
+    </w:p>
+    <w:p>
+      <w:pPr>
+        <w:pStyle w:val="ListNumber"/>
+        <w:spacing w:before="0" w:after="40"/>
+      </w:pPr>
+      <w:r>
+        <w:rPr>
+          <w:rFonts w:ascii="Segoe UI" w:hAnsi="Segoe UI"/>
+          <w:color w:val="374151"/>
+          <w:sz w:val="21"/>
+        </w:rPr>
+        <w:t>Select which platforms should receive the updates by checking/unchecking the **Push updates to** options.</w:t>
+      </w:r>
+    </w:p>
+    <w:p>
+      <w:pPr>
+        <w:pStyle w:val="ListNumber"/>
+        <w:spacing w:before="0" w:after="40"/>
+      </w:pPr>
+      <w:r>
+        <w:rPr>
+          <w:rFonts w:ascii="Segoe UI" w:hAnsi="Segoe UI"/>
+          <w:color w:val="374151"/>
+          <w:sz w:val="21"/>
+        </w:rPr>
+        <w:t>Click **Save Product** to execute platform sync tasks.</w:t>
+      </w:r>
+    </w:p>
+    <w:p>
+      <w:pPr>
+        <w:keepNext/>
+        <w:spacing w:before="240" w:after="80"/>
+      </w:pPr>
+      <w:r>
+        <w:rPr>
+          <w:rFonts w:ascii="Segoe UI" w:hAnsi="Segoe UI"/>
+          <w:b/>
+          <w:color w:val="374151"/>
+          <w:sz w:val="24"/>
+        </w:rPr>
+        <w:t>4.3 Delete (Retract Master SKU)</w:t>
+      </w:r>
+    </w:p>
+    <w:p>
+      <w:pPr>
+        <w:pStyle w:val="ListNumber"/>
+        <w:spacing w:before="0" w:after="40"/>
+      </w:pPr>
+      <w:r>
+        <w:rPr>
+          <w:rFonts w:ascii="Segoe UI" w:hAnsi="Segoe UI"/>
+          <w:color w:val="374151"/>
+          <w:sz w:val="21"/>
+        </w:rPr>
+        <w:t>Click the **🗑️ Del** button in the actions column of the target product row.</w:t>
+      </w:r>
+    </w:p>
+    <w:p>
+      <w:pPr>
+        <w:pStyle w:val="ListNumber"/>
+        <w:spacing w:before="0" w:after="40"/>
+      </w:pPr>
+      <w:r>
+        <w:rPr>
+          <w:rFonts w:ascii="Segoe UI" w:hAnsi="Segoe UI"/>
+          <w:color w:val="374151"/>
+          <w:sz w:val="21"/>
+        </w:rPr>
+        <w:t>A deletion confirmation dialog will display.</w:t>
+      </w:r>
+    </w:p>
+    <w:p>
+      <w:pPr>
+        <w:pStyle w:val="ListNumber"/>
+        <w:spacing w:before="0" w:after="40"/>
+      </w:pPr>
+      <w:r>
+        <w:rPr>
+          <w:rFonts w:ascii="Segoe UI" w:hAnsi="Segoe UI"/>
+          <w:color w:val="374151"/>
+          <w:sz w:val="21"/>
+        </w:rPr>
+        <w:t>Check the platforms from which you wish to retract listings under **Also Delete Listing Listings On Platform Shops**.</w:t>
+      </w:r>
+    </w:p>
+    <w:p>
+      <w:pPr>
+        <w:pStyle w:val="ListNumber"/>
+        <w:spacing w:before="0" w:after="40"/>
+      </w:pPr>
+      <w:r>
+        <w:rPr>
+          <w:rFonts w:ascii="Segoe UI" w:hAnsi="Segoe UI"/>
+          <w:color w:val="374151"/>
+          <w:sz w:val="21"/>
+        </w:rPr>
+        <w:t>Click **Confirm Delete SKU**. The system removes the central catalog item and issues listing retraction calls to the selected platforms.</w:t>
       </w:r>
     </w:p>
     <w:sectPr>

</xml_diff>

<commit_message>
Consolidate Billing pricing plans inside Merchant Profile sub-tabs nav and cleanup sidebar links
</commit_message>
<xml_diff>
--- a/docs/User_Manual.docx
+++ b/docs/User_Manual.docx
@@ -1740,7 +1740,7 @@
           <w:color w:val="374151"/>
           <w:sz w:val="21"/>
         </w:rPr>
-        <w:t>Navigate to the **Merchant Profile** tab on the sidebar to adjust security parameters, postpaid subscription plans, and workspace limits.</w:t>
+        <w:t>Navigate to the **Merchant Profile** tab on the sidebar. The panel is split into two sub-tabs: **Personal &amp; Security** and **Subscription Plans**.</w:t>
       </w:r>
     </w:p>
     <w:p>
@@ -1755,7 +1755,20 @@
           <w:color w:val="374151"/>
           <w:sz w:val="24"/>
         </w:rPr>
-        <w:t>5.1 Editing Profile Identity</w:t>
+        <w:t>5.1 Personal &amp; Security Sub-tab</w:t>
+      </w:r>
+    </w:p>
+    <w:p>
+      <w:pPr>
+        <w:spacing w:before="0" w:after="120" w:line="276" w:lineRule="auto"/>
+      </w:pPr>
+      <w:r>
+        <w:rPr>
+          <w:rFonts w:ascii="Segoe UI" w:hAnsi="Segoe UI"/>
+          <w:color w:val="374151"/>
+          <w:sz w:val="21"/>
+        </w:rPr>
+        <w:t>Under this tab, you can manage personal identity, update passwords, and manage active session terminals:</w:t>
       </w:r>
     </w:p>
     <w:p>
@@ -1844,6 +1857,34 @@
     </w:p>
     <w:p>
       <w:pPr>
+        <w:pStyle w:val="ListNumber"/>
+        <w:spacing w:before="0" w:after="40"/>
+      </w:pPr>
+      <w:r>
+        <w:rPr>
+          <w:rFonts w:ascii="Segoe UI" w:hAnsi="Segoe UI"/>
+          <w:color w:val="374151"/>
+          <w:sz w:val="21"/>
+        </w:rPr>
+        <w:t>Under **Update Credentials**, update account password and audit strength.</w:t>
+      </w:r>
+    </w:p>
+    <w:p>
+      <w:pPr>
+        <w:pStyle w:val="ListNumber"/>
+        <w:spacing w:before="0" w:after="40"/>
+      </w:pPr>
+      <w:r>
+        <w:rPr>
+          <w:rFonts w:ascii="Segoe UI" w:hAnsi="Segoe UI"/>
+          <w:color w:val="374151"/>
+          <w:sz w:val="21"/>
+        </w:rPr>
+        <w:t>Under **Active Authorized Terminals**, inspect or revoke device access tokens.</w:t>
+      </w:r>
+    </w:p>
+    <w:p>
+      <w:pPr>
         <w:keepNext/>
         <w:spacing w:before="240" w:after="80"/>
       </w:pPr>
@@ -1854,7 +1895,7 @@
           <w:color w:val="374151"/>
           <w:sz w:val="24"/>
         </w:rPr>
-        <w:t>5.2 Subscription Configuration (Postpay Model)</w:t>
+        <w:t>5.2 Subscription Plans Sub-tab</w:t>
       </w:r>
     </w:p>
     <w:p>
@@ -1882,6 +1923,20 @@
           <w:sz w:val="21"/>
         </w:rPr>
         <w:t>**Tiers &amp; Payment Method Selection**: You can change your active tier dropdown (Free, Basic, Advance) or select a Payment Method (Credit Card, PromptPay QR Autopay, E-Wallet) and click **Save Billing Info**.</w:t>
+      </w:r>
+    </w:p>
+    <w:p>
+      <w:pPr>
+        <w:pStyle w:val="ListBullet"/>
+        <w:spacing w:before="0" w:after="40"/>
+      </w:pPr>
+      <w:r>
+        <w:rPr>
+          <w:rFonts w:ascii="Segoe UI" w:hAnsi="Segoe UI"/>
+          <w:color w:val="374151"/>
+          <w:sz w:val="21"/>
+        </w:rPr>
+        <w:t>**Comparative Plan Grid**: Review the limits and benefits of the Free, Basic, and Advance tiers. Click **Upgrade to Basic** or **Upgrade to Advance** to trigger the multi-tab payment gateway and Thai PromptPay QR checkout overlay.</w:t>
       </w:r>
     </w:p>
     <w:p>
@@ -1923,7 +1978,7 @@
           <w:color w:val="374151"/>
           <w:sz w:val="21"/>
         </w:rPr>
-        <w:t>Under **Subscription &amp; Billing**, click the **Cancel Subscription** button.</w:t>
+        <w:t>Under **Subscription Plans**, click the **Cancel Subscription** button.</w:t>
       </w:r>
     </w:p>
     <w:p>

</xml_diff>